<commit_message>
EE250 notes update in PCB practice branch; TODO: move this to main
</commit_message>
<xml_diff>
--- a/ee250 notes.docx
+++ b/ee250 notes.docx
@@ -83,15 +83,7 @@
         </w:numPr>
       </w:pPr>
       <w:r>
-        <w:t xml:space="preserve">The middle bridge between </w:t>
-      </w:r>
-      <w:proofErr w:type="spellStart"/>
-      <w:r>
-        <w:t>scr</w:t>
-      </w:r>
-      <w:proofErr w:type="spellEnd"/>
-      <w:r>
-        <w:t xml:space="preserve"> code file and hardware executable </w:t>
+        <w:t xml:space="preserve">The middle bridge between scr code file and hardware executable </w:t>
       </w:r>
     </w:p>
     <w:p>
@@ -157,15 +149,8 @@
           <w:numId w:val="1"/>
         </w:numPr>
       </w:pPr>
-      <w:proofErr w:type="spellStart"/>
-      <w:proofErr w:type="gramStart"/>
-      <w:r>
-        <w:t>a,b</w:t>
-      </w:r>
-      <w:proofErr w:type="spellEnd"/>
-      <w:proofErr w:type="gramEnd"/>
-      <w:r>
-        <w:t xml:space="preserve"> are the memory address; R1, R2 are the registers</w:t>
+      <w:r>
+        <w:t>a,b are the memory address; R1, R2 are the registers</w:t>
       </w:r>
     </w:p>
     <w:p>
@@ -254,13 +239,8 @@
           <w:numId w:val="1"/>
         </w:numPr>
       </w:pPr>
-      <w:proofErr w:type="gramStart"/>
-      <w:r>
-        <w:t>Open source</w:t>
-      </w:r>
-      <w:proofErr w:type="gramEnd"/>
-      <w:r>
-        <w:t xml:space="preserve"> RISC: RISC-V</w:t>
+      <w:r>
+        <w:t>Open source RISC: RISC-V</w:t>
       </w:r>
     </w:p>
     <w:p>
@@ -352,6 +332,70 @@
     </w:p>
     <w:p/>
     <w:p/>
+    <w:p/>
+    <w:p/>
+    <w:p/>
+    <w:p>
+      <w:r>
+        <w:rPr>
+          <w:noProof/>
+        </w:rPr>
+        <w:drawing>
+          <wp:inline distT="0" distB="0" distL="0" distR="0" wp14:anchorId="67415033" wp14:editId="454D87B9">
+            <wp:extent cx="3851275" cy="2542540"/>
+            <wp:effectExtent l="0" t="0" r="0" b="0"/>
+            <wp:docPr id="259881978" name="Picture 2"/>
+            <wp:cNvGraphicFramePr>
+              <a:graphicFrameLocks xmlns:a="http://schemas.openxmlformats.org/drawingml/2006/main" noChangeAspect="1"/>
+            </wp:cNvGraphicFramePr>
+            <a:graphic xmlns:a="http://schemas.openxmlformats.org/drawingml/2006/main">
+              <a:graphicData uri="http://schemas.openxmlformats.org/drawingml/2006/picture">
+                <pic:pic xmlns:pic="http://schemas.openxmlformats.org/drawingml/2006/picture">
+                  <pic:nvPicPr>
+                    <pic:cNvPr id="0" name="Picture 3"/>
+                    <pic:cNvPicPr>
+                      <a:picLocks noChangeAspect="1" noChangeArrowheads="1"/>
+                    </pic:cNvPicPr>
+                  </pic:nvPicPr>
+                  <pic:blipFill>
+                    <a:blip r:embed="rId6">
+                      <a:extLst>
+                        <a:ext uri="{28A0092B-C50C-407E-A947-70E740481C1C}">
+                          <a14:useLocalDpi xmlns:a14="http://schemas.microsoft.com/office/drawing/2010/main" val="0"/>
+                        </a:ext>
+                      </a:extLst>
+                    </a:blip>
+                    <a:srcRect/>
+                    <a:stretch>
+                      <a:fillRect/>
+                    </a:stretch>
+                  </pic:blipFill>
+                  <pic:spPr bwMode="auto">
+                    <a:xfrm>
+                      <a:off x="0" y="0"/>
+                      <a:ext cx="3851275" cy="2542540"/>
+                    </a:xfrm>
+                    <a:prstGeom prst="rect">
+                      <a:avLst/>
+                    </a:prstGeom>
+                    <a:noFill/>
+                    <a:ln>
+                      <a:noFill/>
+                    </a:ln>
+                  </pic:spPr>
+                </pic:pic>
+              </a:graphicData>
+            </a:graphic>
+          </wp:inline>
+        </w:drawing>
+      </w:r>
+    </w:p>
+    <w:p/>
+    <w:p>
+      <w:r>
+        <w:t>Eine Organisation, die nicht nur bestechliche Wächter, läppische Aufseher und Untersuchungsrichter, die günstigsten Falles bescheiden sind, beschäftigt, sondern die weiterhin jedenfalls eine Richterschaft hohen und höchsten Grades unterhält, mit dem zahllosen, unumgänglichen Gefolge von Dienern, Schreibern, Gendarmen und andern Hilfskräften, vielleicht sogar Henkern, ich scheue vor dem Wort nicht zurück.</w:t>
+      </w:r>
+    </w:p>
     <w:sectPr>
       <w:pgSz w:w="12240" w:h="15840"/>
       <w:pgMar w:top="1440" w:right="1440" w:bottom="1440" w:left="1440" w:header="720" w:footer="720" w:gutter="0"/>

</xml_diff>